<commit_message>
Finaliza calendario de outubro: atualiza post 23/10 e regenera documentos
Substitui a imagem generica do post de 23/10 (Primeira Sessao) pela
foto real da equipe. Corrige espacamento do titulo no PDF/docx e
remove o aviso de imagem pendente, ja que o calendario de outubro
esta completo e pronto para aprovacao final da cliente.

Co-Authored-By: Claude Sonnet 5 <noreply@anthropic.com>
Claude-Session: https://claude.ai/code/session_01FMSQvWS8BY8mpFHBetf8tC
</commit_message>
<xml_diff>
--- a/refugio-dos-4-elementos/social-media-outubro-2026/Calendario-Editorial-Outubro-2026.docx
+++ b/refugio-dos-4-elementos/social-media-outubro-2026/Calendario-Editorial-Outubro-2026.docx
@@ -5,7 +5,7 @@
     <w:p>
       <w:pPr>
         <w:pStyle w:val="Title"/>
-        <w:spacing w:after="100"/>
+        <w:spacing w:after="200" w:line="360"/>
       </w:pPr>
       <w:r>
         <w:rPr>
@@ -20,7 +20,7 @@
     </w:p>
     <w:p>
       <w:pPr>
-        <w:spacing w:after="300"/>
+        <w:spacing w:after="300" w:before="100"/>
       </w:pPr>
       <w:r>
         <w:rPr>
@@ -1172,21 +1172,6 @@
         </w:pBdr>
         <w:spacing w:after="300" w:before="200"/>
       </w:pPr>
-    </w:p>
-    <w:p>
-      <w:pPr>
-        <w:spacing w:after="200"/>
-      </w:pPr>
-      <w:r>
-        <w:rPr>
-          <w:i/>
-          <w:iCs/>
-          <w:color w:val="B85A2E"/>
-          <w:sz w:val="20"/>
-          <w:szCs w:val="20"/>
-        </w:rPr>
-        <w:t xml:space="preserve">⚠ Imagem ainda será substituída (nova foto da equipe a caminho)</w:t>
-      </w:r>
     </w:p>
     <w:p>
       <w:pPr>

</xml_diff>